<commit_message>
docs: S03 acta + TC-064 Parcial + RNF 1.0.2
Co-authored-by: Cursor <cursoragent@cursor.com>
</commit_message>
<xml_diff>
--- a/fase2/Evidencias Grupales/2.4_GuiaEstudiante_Fase 2_DesarrolloProyecto APT.docx
+++ b/fase2/Evidencias Grupales/2.4_GuiaEstudiante_Fase 2_DesarrolloProyecto APT.docx
@@ -863,7 +863,7 @@
               <w:rPr>
                 <w:rFonts w:ascii="Calibri" w:eastAsia="Calibri" w:hAnsi="Calibri" w:cs="Calibri"/>
               </w:rPr>
-              <w:t xml:space="preserve"> [ISO], 2021). Catálogo CSY4111: 19 casos = 15 OK, 2 parciales (MTC-12 y MTC-13), 1 NOK y 1 bloqueado. Jest hu06Tuu + </w:t>
+              <w:t xml:space="preserve"> [ISO], 2021). Catálogo CSY4111: 19 casos = 15 OK, 2 parciales (MTC-12 y MTC-13), 1 NOK y 0 bloqueados. Jest hu06Tuu + </w:t>
             </w:r>
             <w:proofErr w:type="spellStart"/>
             <w:r>
@@ -891,7 +891,7 @@
               <w:rPr>
                 <w:rFonts w:ascii="Calibri" w:eastAsia="Calibri" w:hAnsi="Calibri" w:cs="Calibri"/>
               </w:rPr>
-              <w:t xml:space="preserve">Pendientes al corte: emisión de DTE (boleta 39); re-test de TC-063 sin USB; TC-064 en terminal Kozen. Timeout oficial de checkout: 300 s.</w:t>
+              <w:t xml:space="preserve">Pendientes al corte: emisión de DTE (boleta 39); re-test de TC-063 sin USB; TC-064 Parcial en Kozen P8 Neo (13/10; falta crédito aprobado). Timeout oficial de checkout: 300 s.</w:t>
             </w:r>
             <w:proofErr w:type="spellStart"/>
             <w:r>
@@ -1065,7 +1065,7 @@
               <w:rPr>
                 <w:rFonts w:ascii="Calibri" w:eastAsia="Calibri" w:hAnsi="Calibri" w:cs="Calibri"/>
               </w:rPr>
-              <w:t>3. Implementar Webpay como MVP funcional — En curso: aprobado y rechazado PASS; TC-063 parcial; TC-064 bloqueado. Ajuste de medio: el cobro en el celular genérico se hace con un QR que apunta al proxy, Transbank no entrega un QR nativo.</w:t>
+              <w:t>3. Implementar Webpay como MVP funcional — En curso: aprobado y rechazado PASS; TC-063 parcial; TC-064 / TC-RG-01 Parcial (13/10, Kozen). Ajuste de medio: el cobro en el celular genérico se hace con un QR que apunta al proxy, Transbank no entrega un QR nativo.</w:t>
             </w:r>
           </w:p>
           <w:p>
@@ -1397,7 +1397,7 @@
               <w:rPr>
                 <w:rFonts w:ascii="Calibri" w:eastAsia="Calibri" w:hAnsi="Calibri" w:cs="Calibri"/>
               </w:rPr>
-              <w:t>Documentación: DAS v1.0.2 y ADR-002 (Madrid, 2026); catálogo RNF ISO/IEC 25010 v1.0.1 (Munzenmayer, 2026a); Plan de Pruebas v1.2, catálogo CSY4111 (15 OK, 2 parciales, 1 NOK, 1 bloqueado de 19) y Listado de Defectos v1.2 (Munzenmayer, 2026b, 2026c). Actas S01 y S02 firmadas el 04/10.</w:t>
+              <w:t>Documentación: DAS v1.0.2 y ADR-002 (Madrid, 2026); catálogo RNF ISO/IEC 25010 v1.0.1 (Munzenmayer, 2026a); Plan de Pruebas v1.2, catálogo CSY4111 (15 OK, 2 parciales (MTC-12, MTC-13), 1 NOK, 0 bloqueados de 19) y Listado de Defectos v1.2 (Munzenmayer, 2026b, 2026c). Actas S01 y S02 firmadas el 04/10.</w:t>
             </w:r>
           </w:p>
           <w:p>
@@ -1408,7 +1408,7 @@
               <w:rPr>
                 <w:rFonts w:ascii="Calibri" w:eastAsia="Calibri" w:hAnsi="Calibri" w:cs="Calibri"/>
               </w:rPr>
-              <w:t xml:space="preserve">Pruebas manuales HU-06: Webpay aprobado PASS (Figura 1) y rechazado PASS (Figura 2); TC-063 parcial; TC-064 bloqueado a la espera de Diego Madrid (TUU/Kozen en producción). Dispositivo: Celular Android. Timeout oficial: 300 s.</w:t>
+              <w:t xml:space="preserve">Pruebas manuales HU-06: Webpay aprobado PASS (Figura 1) y rechazado PASS (Figura 2); TC-063 parcial; TC-064 / TC-RG-01 Parcial (13/10/2026, Kozen P8 Neo, Diego Madrid); evidencia en Sprint_03/capturas_20261013/. Dispositivo: Celular Android. Timeout oficial: 300 s.</w:t>
             </w:r>
             <w:proofErr w:type="spellStart"/>
             <w:r>
@@ -2726,7 +2726,7 @@
                 <w:sz w:val="18"/>
                 <w:szCs w:val="18"/>
               </w:rPr>
-              <w:t>Plan v1.2; 19 casos = 15 OK, 2 parciales (MTC-12, MTC-13), 1 NOK, 1 bloqueado. HU-06 aprobado/rechazado PASS; TC-063 parcial; TC-064 bloqueado.</w:t>
+              <w:t>Plan v1.2; 19 casos = 15 OK, 2 parciales (MTC-12 y MTC-13), 1 NOK y 0 bloqueados (TC-064 / TC-RG-01 Parcial, regresión TUU Kozen fuera del conteo 15 MTC). HU-06 aprobado/rechazado PASS; TC-063 parcial; TC-064 / TC-RG-01 Parcial (13/10, Kozen).</w:t>
             </w:r>
           </w:p>
         </w:tc>
@@ -5128,7 +5128,7 @@
                 <w:sz w:val="18"/>
                 <w:szCs w:val="18"/>
               </w:rPr>
-              <w:t>El equipo académico no tiene terminal. D-PAY 2.0 sigue en producción.</w:t>
+              <w:t>Diego Madrid ejecutó TC-064 / TC-RG-01 en Kozen P8 Neo el 13/10/2026 (capturas Sprint_03/capturas_20261013/). D-PAY 2.0 sigue en producción.</w:t>
             </w:r>
           </w:p>
         </w:tc>
@@ -5180,7 +5180,7 @@
                 <w:sz w:val="18"/>
                 <w:szCs w:val="18"/>
               </w:rPr>
-              <w:t>TC-064 Bloqueado: en espera de ejecución por Diego Madrid. Cobertura actual: Jest 17/17.</w:t>
+              <w:t>TC-064 / TC-RG-01 Parcial (13/10/2026, Kozen P8 Neo, Diego Madrid): débito $2.000 aprobado (Pago exitoso); crédito $5.000 cancelado (Transacción cancelada, no declined emisor). Jest 17/17. Falta comprobante de crédito aprobado. Cobertura: Jest 17/17 + capturas Kozen 13/10.</w:t>
             </w:r>
           </w:p>
         </w:tc>
@@ -6333,7 +6333,7 @@
               <w:rPr>
                 <w:rFonts w:ascii="Calibri" w:eastAsia="Calibri" w:hAnsi="Calibri" w:cs="Calibri"/>
               </w:rPr>
-              <w:t>Regresión TUU/Kozen: la prueba manual (TC-064) queda bloqueada, en espera de ejecución por Diego Madrid (TUU/Kozen en producción); mientras tanto la cubren 17 pruebas unitarias.</w:t>
+              <w:t>Regresión TUU/Kozen: TC-064 / TC-RG-01 Parcial el 13/10/2026 (Diego Madrid, Kozen P8 Neo; capturas Sprint_03). Falta crédito aprobado. Además 17 pruebas unitarias.</w:t>
             </w:r>
           </w:p>
           <w:p>
@@ -6552,7 +6552,7 @@
               <w:rPr>
                 <w:rFonts w:ascii="Calibri" w:eastAsia="Calibri" w:hAnsi="Calibri" w:cs="Calibri"/>
               </w:rPr>
-              <w:t>TC-064 regresión TUU/Kozen — Bloqueado. Motivo: el equipo académico no tiene terminal. Estrategia: en espera de ejecución por Diego Madrid (TUU/Kozen en producción).</w:t>
+              <w:t>TC-064 regresión TUU/Kozen — Parcial (13/10/2026). Motivo: el equipo académico no tiene terminal. Estrategia: en espera de ejecución por Diego Madrid (TUU/Kozen en producción).</w:t>
             </w:r>
           </w:p>
           <w:p>

</xml_diff>